<commit_message>
Added Register User, User profile and modifications page
</commit_message>
<xml_diff>
--- a/Documentation/Coding Standards.docx
+++ b/Documentation/Coding Standards.docx
@@ -1902,7 +1902,7 @@
                 <w:vertAlign w:val="baseline"/>
                 <w:rtl w:val="0"/>
               </w:rPr>
-              <w:t xml:space="preserve">PART 7 - ANTI-PATTERNS TO AVOId</w:t>
+              <w:t xml:space="preserve">PART 7 - ANTI-PATTERNS TO AVOID</w:t>
               <w:tab/>
               <w:t xml:space="preserve">26</w:t>
             </w:r>
@@ -22433,7 +22433,7 @@
         </w:rPr>
         <w:t xml:space="preserve">. </w:t>
         <w:br w:type="textWrapping"/>
-        <w:t xml:space="preserve">Merge back to main via pull request.</w:t>
+        <w:t xml:space="preserve">Merge back to master via pull request.</w:t>
       </w:r>
     </w:p>
     <w:p>
@@ -22887,7 +22887,7 @@
           <w:vertAlign w:val="baseline"/>
           <w:rtl w:val="0"/>
         </w:rPr>
-        <w:t xml:space="preserve">Always rebase your feature branch onto main before raising a PR.</w:t>
+        <w:t xml:space="preserve">Always rebase your feature branch onto master before raising a PR.</w:t>
       </w:r>
     </w:p>
     <w:p>
@@ -30822,7 +30822,7 @@
                 <w:szCs w:val="18"/>
                 <w:rtl w:val="0"/>
               </w:rPr>
-              <w:t xml:space="preserve">Add date</w:t>
+              <w:t xml:space="preserve">2026-04-24</w:t>
             </w:r>
             <w:r>
               <w:rPr>

</xml_diff>